<commit_message>
Fix N_SPECIALTIES placeholder and align with Elsevier author guide
- Add missing f-string prefix so abstract prints '12' instead of '{N_SPECIALTIES}'.
- Add automatic section numbering (1. Introduction, 2. Materials and methods, etc.)
  with Abstract/References/Declarations/Supplementary headings left unnumbered.
- Reduce highlights to 5 bullet points (max 85 chars each).
- Simplify keywords to 5 entries, avoiding multi-word phrases where possible.
- Regenerate all submission files.

Refs: PR #349
Co-Authored-By: Tatsuki Onishi <bougtoir@gmail.com>
</commit_message>
<xml_diff>
--- a/medical_accident_its_analysis/manuscript/ha_highlights.docx
+++ b/medical_accident_its_analysis/manuscript/ha_highlights.docx
@@ -49,19 +49,6 @@
           <w:sz w:val="24"/>
         </w:rPr>
         <w:t>Equivalence, bootstrap, and power diagnostics support an informative null.</w:t>
-      </w:r>
-    </w:p>
-    <w:p>
-      <w:pPr>
-        <w:pStyle w:val="ListBullet"/>
-        <w:spacing w:line="360" w:lineRule="auto" w:after="80"/>
-      </w:pPr>
-      <w:r>
-        <w:rPr>
-          <w:rFonts w:ascii="Times New Roman" w:hAnsi="Times New Roman"/>
-          <w:sz w:val="24"/>
-        </w:rPr>
-        <w:t>JOCS-CP effect is exploratory and not robust to small-cluster inference.</w:t>
       </w:r>
     </w:p>
     <w:p>

</xml_diff>